<commit_message>
WHO 2021 schema: enhance report with 6-figure set, add seven-grade FAI manuscript
</commit_message>
<xml_diff>
--- a/comprehensive_report_who2021.docx
+++ b/comprehensive_report_who2021.docx
@@ -2027,7 +2027,7 @@
     </w:p>
     <w:bookmarkEnd w:id="21"/>
     <w:bookmarkEnd w:id="22"/>
-    <w:bookmarkStart w:id="36" w:name="results"/>
+    <w:bookmarkStart w:id="50" w:name="results"/>
     <w:p>
       <w:pPr>
         <w:pStyle w:val="Heading1"/>
@@ -4183,8 +4183,306 @@
       </w:r>
     </w:p>
     <w:bookmarkEnd w:id="35"/>
-    <w:bookmarkEnd w:id="36"/>
-    <w:bookmarkStart w:id="41" w:name="discussion"/>
+    <w:bookmarkStart w:id="44" w:name="Xe49c92b3137a364ac4b5576c2cf1c5a37c0da71"/>
+    <w:p>
+      <w:pPr>
+        <w:pStyle w:val="Heading2"/>
+      </w:pPr>
+      <w:r>
+        <w:t xml:space="preserve">3.5 Agreement structure: confusion matrix and Bland-Altman</w:t>
+      </w:r>
+    </w:p>
+    <w:p>
+      <w:pPr>
+        <w:pStyle w:val="FirstParagraph"/>
+      </w:pPr>
+      <w:r>
+        <w:t xml:space="preserve">The confusion matrix of the WHO 2021 variant labels against the crisp reference is strictly adjacent: every off-diagonal count sits one grade from the diagonal, and the largest of them (114 ears, 2.9%) is the Mild–Moderate pair that straddles the 35 dB boundary. The 26 ears the reference calls Normal but the variant calls Mild all lie in the 20–25 dB zone, where the WHO 2021 normal threshold itself moved.</w:t>
+      </w:r>
+    </w:p>
+    <w:tbl>
+      <w:tblPr>
+        <w:tblStyle w:val="Table"/>
+        <w:tblW w:type="pct" w:w="5000"/>
+        <w:tblLayout w:type="fixed"/>
+        <w:tblLook w:firstRow="0" w:lastRow="0" w:firstColumn="0" w:lastColumn="0" w:noHBand="0" w:noVBand="0" w:val="0000"/>
+      </w:tblPr>
+      <w:tblGrid>
+        <w:gridCol w:w="7920"/>
+      </w:tblGrid>
+      <w:tr>
+        <w:tc>
+          <w:tcPr/>
+          <w:bookmarkStart w:id="39" w:name="fig-4"/>
+          <w:p>
+            <w:pPr>
+              <w:pStyle w:val="Compact"/>
+              <w:jc w:val="center"/>
+            </w:pPr>
+            <w:r>
+              <w:drawing>
+                <wp:inline>
+                  <wp:extent cx="4533900" cy="3526366"/>
+                  <wp:effectExtent b="0" l="0" r="0" t="0"/>
+                  <wp:docPr descr="" title="" id="37" name="Picture"/>
+                  <a:graphic>
+                    <a:graphicData uri="http://schemas.openxmlformats.org/drawingml/2006/picture">
+                      <pic:pic>
+                        <pic:nvPicPr>
+                          <pic:cNvPr descr="data/output_who2021/figures/fig6_confusion.png" id="38" name="Picture"/>
+                          <pic:cNvPicPr>
+                            <a:picLocks noChangeArrowheads="1" noChangeAspect="1"/>
+                          </pic:cNvPicPr>
+                        </pic:nvPicPr>
+                        <pic:blipFill>
+                          <a:blip r:embed="rId36"/>
+                          <a:stretch>
+                            <a:fillRect/>
+                          </a:stretch>
+                        </pic:blipFill>
+                        <pic:spPr bwMode="auto">
+                          <a:xfrm>
+                            <a:off x="0" y="0"/>
+                            <a:ext cx="4533900" cy="3526366"/>
+                          </a:xfrm>
+                          <a:prstGeom prst="rect">
+                            <a:avLst/>
+                          </a:prstGeom>
+                          <a:noFill/>
+                          <a:ln w="9525">
+                            <a:noFill/>
+                            <a:headEnd/>
+                            <a:tailEnd/>
+                          </a:ln>
+                        </pic:spPr>
+                      </pic:pic>
+                    </a:graphicData>
+                  </a:graphic>
+                </wp:inline>
+              </w:drawing>
+            </w:r>
+          </w:p>
+          <w:p>
+            <w:pPr>
+              <w:jc w:val="center"/>
+            </w:pPr>
+            <w:pPr>
+              <w:jc w:val="left"/>
+              <w:spacing w:before="200"/>
+              <w:pStyle w:val="ImageCaption"/>
+            </w:pPr>
+            <w:r>
+              <w:t xml:space="preserve">Figure 4: Confusion matrix of WHO 2021 variant labels against the WHO 2021 crisp reference on the held-out test set (n = 3,912). Rows are the reference grade, columns the variant label. Misclassification is confined to adjacent grades.</w:t>
+            </w:r>
+          </w:p>
+          <w:bookmarkEnd w:id="39"/>
+        </w:tc>
+      </w:tr>
+    </w:tbl>
+    <w:p>
+      <w:pPr>
+        <w:pStyle w:val="BodyText"/>
+      </w:pPr>
+      <w:r>
+        <w:t xml:space="preserve">The Bland-Altman analysis places the variant’s FAI within 0.5 dB of PTA-4 on average, with 95% limits of agreement from −11.0 to +11.9 dB. The scatter is tightest in the normal zone and widens with severity, which is expected for a graded index whose upper tail is sparsely populated in a working-age cohort.</w:t>
+      </w:r>
+    </w:p>
+    <w:tbl>
+      <w:tblPr>
+        <w:tblStyle w:val="Table"/>
+        <w:tblW w:type="pct" w:w="5000"/>
+        <w:tblLayout w:type="fixed"/>
+        <w:tblLook w:firstRow="0" w:lastRow="0" w:firstColumn="0" w:lastColumn="0" w:noHBand="0" w:noVBand="0" w:val="0000"/>
+      </w:tblPr>
+      <w:tblGrid>
+        <w:gridCol w:w="7920"/>
+      </w:tblGrid>
+      <w:tr>
+        <w:tc>
+          <w:tcPr/>
+          <w:bookmarkStart w:id="43" w:name="fig-5"/>
+          <w:p>
+            <w:pPr>
+              <w:pStyle w:val="Compact"/>
+              <w:jc w:val="center"/>
+            </w:pPr>
+            <w:r>
+              <w:drawing>
+                <wp:inline>
+                  <wp:extent cx="4800600" cy="2933700"/>
+                  <wp:effectExtent b="0" l="0" r="0" t="0"/>
+                  <wp:docPr descr="" title="" id="41" name="Picture"/>
+                  <a:graphic>
+                    <a:graphicData uri="http://schemas.openxmlformats.org/drawingml/2006/picture">
+                      <pic:pic>
+                        <pic:nvPicPr>
+                          <pic:cNvPr descr="data/output_who2021/figures/fig5_bland_altman.png" id="42" name="Picture"/>
+                          <pic:cNvPicPr>
+                            <a:picLocks noChangeArrowheads="1" noChangeAspect="1"/>
+                          </pic:cNvPicPr>
+                        </pic:nvPicPr>
+                        <pic:blipFill>
+                          <a:blip r:embed="rId40"/>
+                          <a:stretch>
+                            <a:fillRect/>
+                          </a:stretch>
+                        </pic:blipFill>
+                        <pic:spPr bwMode="auto">
+                          <a:xfrm>
+                            <a:off x="0" y="0"/>
+                            <a:ext cx="4800600" cy="2933700"/>
+                          </a:xfrm>
+                          <a:prstGeom prst="rect">
+                            <a:avLst/>
+                          </a:prstGeom>
+                          <a:noFill/>
+                          <a:ln w="9525">
+                            <a:noFill/>
+                            <a:headEnd/>
+                            <a:tailEnd/>
+                          </a:ln>
+                        </pic:spPr>
+                      </pic:pic>
+                    </a:graphicData>
+                  </a:graphic>
+                </wp:inline>
+              </w:drawing>
+            </w:r>
+          </w:p>
+          <w:p>
+            <w:pPr>
+              <w:jc w:val="center"/>
+            </w:pPr>
+            <w:pPr>
+              <w:jc w:val="left"/>
+              <w:spacing w:before="200"/>
+              <w:pStyle w:val="ImageCaption"/>
+            </w:pPr>
+            <w:r>
+              <w:t xml:space="preserve">Figure 5: Bland-Altman plot of FAI against PTA-4 for the WHO 2021 variant on the held-out test set, coloured by WHO 2021 reference grade. Bias +0.5 dB (95% limits −11.0 to +11.9 dB).</w:t>
+            </w:r>
+          </w:p>
+          <w:bookmarkEnd w:id="43"/>
+        </w:tc>
+      </w:tr>
+    </w:tbl>
+    <w:bookmarkEnd w:id="44"/>
+    <w:bookmarkStart w:id="49" w:name="head-to-head-summary"/>
+    <w:p>
+      <w:pPr>
+        <w:pStyle w:val="Heading2"/>
+      </w:pPr>
+      <w:r>
+        <w:t xml:space="preserve">3.6 Head-to-head summary</w:t>
+      </w:r>
+    </w:p>
+    <w:p>
+      <w:pPr>
+        <w:pStyle w:val="FirstParagraph"/>
+      </w:pPr>
+      <w:r>
+        <w:t xml:space="preserve">Figure</w:t>
+      </w:r>
+      <w:r>
+        <w:t xml:space="preserve"> </w:t>
+      </w:r>
+      <w:hyperlink w:anchor="fig-6">
+        <w:r>
+          <w:rPr>
+            <w:rStyle w:val="Hyperlink"/>
+          </w:rPr>
+          <w:t xml:space="preserve">Figure 6</w:t>
+        </w:r>
+      </w:hyperlink>
+      <w:r>
+        <w:t xml:space="preserve"> </w:t>
+      </w:r>
+      <w:r>
+        <w:t xml:space="preserve">summarises the head-to-head of Section 3.2 on a single chart: the WHO 2021 variant leads the deployed six-grade system on every agreement metric when both are scored against the WHO 2021 reference, with the largest gap in the borderline zone (87.6% vs 66.0%), and a lower MAE (4.49 vs 5.01 dB).</w:t>
+      </w:r>
+    </w:p>
+    <w:tbl>
+      <w:tblPr>
+        <w:tblStyle w:val="Table"/>
+        <w:tblW w:type="pct" w:w="5000"/>
+        <w:tblLayout w:type="fixed"/>
+        <w:tblLook w:firstRow="0" w:lastRow="0" w:firstColumn="0" w:lastColumn="0" w:noHBand="0" w:noVBand="0" w:val="0000"/>
+      </w:tblPr>
+      <w:tblGrid>
+        <w:gridCol w:w="7920"/>
+      </w:tblGrid>
+      <w:tr>
+        <w:tc>
+          <w:tcPr/>
+          <w:bookmarkStart w:id="48" w:name="fig-6"/>
+          <w:p>
+            <w:pPr>
+              <w:pStyle w:val="Compact"/>
+              <w:jc w:val="center"/>
+            </w:pPr>
+            <w:r>
+              <w:drawing>
+                <wp:inline>
+                  <wp:extent cx="5334000" cy="2327563"/>
+                  <wp:effectExtent b="0" l="0" r="0" t="0"/>
+                  <wp:docPr descr="" title="" id="46" name="Picture"/>
+                  <a:graphic>
+                    <a:graphicData uri="http://schemas.openxmlformats.org/drawingml/2006/picture">
+                      <pic:pic>
+                        <pic:nvPicPr>
+                          <pic:cNvPr descr="data/output_who2021/figures/fig4_head_to_head.png" id="47" name="Picture"/>
+                          <pic:cNvPicPr>
+                            <a:picLocks noChangeArrowheads="1" noChangeAspect="1"/>
+                          </pic:cNvPicPr>
+                        </pic:nvPicPr>
+                        <pic:blipFill>
+                          <a:blip r:embed="rId45"/>
+                          <a:stretch>
+                            <a:fillRect/>
+                          </a:stretch>
+                        </pic:blipFill>
+                        <pic:spPr bwMode="auto">
+                          <a:xfrm>
+                            <a:off x="0" y="0"/>
+                            <a:ext cx="5334000" cy="2327563"/>
+                          </a:xfrm>
+                          <a:prstGeom prst="rect">
+                            <a:avLst/>
+                          </a:prstGeom>
+                          <a:noFill/>
+                          <a:ln w="9525">
+                            <a:noFill/>
+                            <a:headEnd/>
+                            <a:tailEnd/>
+                          </a:ln>
+                        </pic:spPr>
+                      </pic:pic>
+                    </a:graphicData>
+                  </a:graphic>
+                </wp:inline>
+              </w:drawing>
+            </w:r>
+          </w:p>
+          <w:p>
+            <w:pPr>
+              <w:jc w:val="center"/>
+            </w:pPr>
+            <w:pPr>
+              <w:jc w:val="left"/>
+              <w:spacing w:before="200"/>
+              <w:pStyle w:val="ImageCaption"/>
+            </w:pPr>
+            <w:r>
+              <w:t xml:space="preserve">Figure 6: Head-to-head comparison of the WHO 2021 variant and the deployed six-grade system on the same 3,912 test ears, both scored against the WHO 2021 reference. Left: agreement metrics (weighted κ × 100, overall, borderline ±5 dB, clear cases). Right: mean absolute error (dB).</w:t>
+            </w:r>
+          </w:p>
+          <w:bookmarkEnd w:id="48"/>
+        </w:tc>
+      </w:tr>
+    </w:tbl>
+    <w:bookmarkEnd w:id="49"/>
+    <w:bookmarkEnd w:id="50"/>
+    <w:bookmarkStart w:id="55" w:name="discussion"/>
     <w:p>
       <w:pPr>
         <w:pStyle w:val="Heading1"/>
@@ -4193,7 +4491,7 @@
         <w:t xml:space="preserve">4. Discussion</w:t>
       </w:r>
     </w:p>
-    <w:bookmarkStart w:id="37" w:name="the-variant-works"/>
+    <w:bookmarkStart w:id="51" w:name="the-variant-works"/>
     <w:p>
       <w:pPr>
         <w:pStyle w:val="Heading2"/>
@@ -4210,8 +4508,8 @@
         <w:t xml:space="preserve">Rebuilding the FAI system under the WHO 2021 seven-grade schema is straightforward and the result validates cleanly: weighted κ 0.953, overall 95.2%, clear-case 98.4% on a held-out participant-level test set. The calibrated FAI label thresholds (20.4/34.0/52.2/64.6/80.3/94.2) land within a decibel of the WHO 2021 dB boundaries, confirming that the continuous FAI scale aligns naturally with the new schema.</w:t>
       </w:r>
     </w:p>
-    <w:bookmarkEnd w:id="37"/>
-    <w:bookmarkStart w:id="38" w:name="Xcbf5029a00b8eb379e67e0d121a552c7d8b65e5"/>
+    <w:bookmarkEnd w:id="51"/>
+    <w:bookmarkStart w:id="52" w:name="Xcbf5029a00b8eb379e67e0d121a552c7d8b65e5"/>
     <w:p>
       <w:pPr>
         <w:pStyle w:val="Heading2"/>
@@ -4228,8 +4526,8 @@
         <w:t xml:space="preserve">The variant’s clearest edge over the deployed system appears in the borderline zone (87.6% vs 66.0% within ±5 dB of a WHO 2021 boundary). Two mechanisms contribute. First, the re-optimised membership functions centre their overlaps on the WHO 2021 boundaries rather than the old ones. Second, the deployed system’s calibrated Severe/Profound thresholds are pathologically squeezed (70.6→74.1, a sparse-tail artifact), which the WHO 2021 calibration avoids (80.3→94.2). A user who wants the graded advantage at the new boundaries should adopt the variant.</w:t>
       </w:r>
     </w:p>
-    <w:bookmarkEnd w:id="38"/>
-    <w:bookmarkStart w:id="39" w:name="what-the-schema-change-means-clinically"/>
+    <w:bookmarkEnd w:id="52"/>
+    <w:bookmarkStart w:id="53" w:name="what-the-schema-change-means-clinically"/>
     <w:p>
       <w:pPr>
         <w:pStyle w:val="Heading2"/>
@@ -4246,8 +4544,8 @@
         <w:t xml:space="preserve">The WHO 2021 normal threshold at 20 dB (down from 25) shifts roughly 6% of working-age test ears from Normal to Mild. This is not a fuzzy-system artefact: it is the classification policy itself. The graded FAI makes the transition visible (a 21 dB ear sits in the normal/mild overlap rather than being silently assigned), which is precisely the information the new schema wants surfaced.</w:t>
       </w:r>
     </w:p>
-    <w:bookmarkEnd w:id="39"/>
-    <w:bookmarkStart w:id="40" w:name="limitations"/>
+    <w:bookmarkEnd w:id="53"/>
+    <w:bookmarkStart w:id="54" w:name="limitations"/>
     <w:p>
       <w:pPr>
         <w:pStyle w:val="Heading2"/>
@@ -4344,9 +4642,9 @@
         <w:t xml:space="preserve">This report is a research variant; adopting it in the deployed calculator, the Ear and Hearing manuscript, or a future submission requires a deliberate decision.</w:t>
       </w:r>
     </w:p>
-    <w:bookmarkEnd w:id="40"/>
-    <w:bookmarkEnd w:id="41"/>
-    <w:bookmarkStart w:id="42" w:name="conclusion"/>
+    <w:bookmarkEnd w:id="54"/>
+    <w:bookmarkEnd w:id="55"/>
+    <w:bookmarkStart w:id="56" w:name="conclusion"/>
     <w:p>
       <w:pPr>
         <w:pStyle w:val="Heading1"/>
@@ -4393,8 +4691,8 @@
         <w:t xml:space="preserve">so the analysis is fully reproducible.</w:t>
       </w:r>
     </w:p>
-    <w:bookmarkEnd w:id="42"/>
-    <w:bookmarkStart w:id="43" w:name="appendix-reproducibility"/>
+    <w:bookmarkEnd w:id="56"/>
+    <w:bookmarkStart w:id="57" w:name="appendix-reproducibility"/>
     <w:p>
       <w:pPr>
         <w:pStyle w:val="Heading1"/>
@@ -4611,7 +4909,7 @@
         <w:t xml:space="preserve">repository (public).</w:t>
       </w:r>
     </w:p>
-    <w:bookmarkEnd w:id="43"/>
+    <w:bookmarkEnd w:id="57"/>
     <w:sectPr>
       <w:footnotePr>
         <w:numRestart w:val="eachSect"/>

</xml_diff>